<commit_message>
fix: update the website and docs
</commit_message>
<xml_diff>
--- a/product-specs/forgearc-website-strategy.docx
+++ b/product-specs/forgearc-website-strategy.docx
@@ -1311,7 +1311,7 @@
           <w:sz w:val="21"/>
           <w:szCs w:val="21"/>
         </w:rPr>
-        <w:t xml:space="preserve">Blog link goes to thinkincloud.in — builds authority signal</w:t>
+        <w:t xml:space="preserve">Blog link goes to techpotato.in — builds authority signal</w:t>
       </w:r>
     </w:p>
     <w:p>
@@ -2644,7 +2644,7 @@
           <w:sz w:val="21"/>
           <w:szCs w:val="21"/>
         </w:rPr>
-        <w:t xml:space="preserve">Contact email and thinkincloud.in brand link — consulting lead capture path</w:t>
+        <w:t xml:space="preserve">Contact email and techpotato.in brand link — consulting lead capture path</w:t>
       </w:r>
     </w:p>
     <w:p>
@@ -5119,7 +5119,7 @@
                 <w:sz w:val="21"/>
                 <w:szCs w:val="21"/>
               </w:rPr>
-              <w:t xml:space="preserve">The marketing website ranks for brand terms and product terms. The thinkincloud.in blog ranks for informational terms ('how to set up LangGraph in production') that drive traffic to the website. Every blog article ends with a CTA linking to forgearc.dev.</w:t>
+              <w:t xml:space="preserve">The marketing website ranks for brand terms and product terms. The techpotato.in blog ranks for informational terms ('how to set up LangGraph in production') that drive traffic to the website. Every blog article ends with a CTA linking to forgearc.dev.</w:t>
             </w:r>
           </w:p>
         </w:tc>
@@ -14035,7 +14035,7 @@
                 <w:sz w:val="19"/>
                 <w:szCs w:val="19"/>
               </w:rPr>
-              <w:t xml:space="preserve">Full article on thinkincloud.in</w:t>
+              <w:t xml:space="preserve">Full article on techpotato.in</w:t>
             </w:r>
           </w:p>
         </w:tc>
@@ -14253,7 +14253,7 @@
           <w:sz w:val="20"/>
           <w:szCs w:val="20"/>
         </w:rPr>
-        <w:t xml:space="preserve">forgearc.dev  ·  thinkincloud.in  ·  Think. Build. Earn. Repeat.</w:t>
+        <w:t xml:space="preserve">forgearc.dev  ·  techpotato.in  ·  TechPotato Softwares LLP</w:t>
       </w:r>
     </w:p>
     <w:sectPr>

</xml_diff>